<commit_message>
Add beta arbitrage to partner marketing kit
</commit_message>
<xml_diff>
--- a/deliverables/sports-centered/Sports_Centered_Promotion_Kit.docx
+++ b/deliverables/sports-centered/Sports_Centered_Promotion_Kit.docx
@@ -60,6 +60,15 @@
         <w:ind w:left="360" w:hanging="187"/>
       </w:pPr>
       <w:r>
+        <w:t>New beta feature: time-sensitive arbitrage opportunity monitoring with percentage-based examples; members must verify live lines before wagering.</w:t>
+      </w:r>
+    </w:p>
+    <w:p>
+      <w:pPr>
+        <w:pStyle w:val="ListBullet"/>
+        <w:ind w:left="360" w:hanging="187"/>
+      </w:pPr>
+      <w:r>
         <w:t>$19.99/month through October 22; regular monthly price $32.99 afterward.</w:t>
       </w:r>
     </w:p>
@@ -91,7 +100,7 @@
         <w:t>Paid partnership with Kobe’s Betting Hub.</w:t>
         <w:br/>
         <w:br/>
-        <w:t>Daily picks, full writeups, and transparent tracked results—plus free Discord access and an optional VIP membership. VIP is $19.99/month through October 22, then $32.99/month.</w:t>
+        <w:t>Daily picks, full writeups, and transparent tracked results—plus free Discord access and an optional VIP membership. NEW: beta arbitrage monitoring identifies potential time-sensitive opportunities across supported sportsbooks, with percentage-based examples to help members compare both sides. Always verify current lines before wagering. VIP is $19.99/month through October 22, then $32.99/month.</w:t>
         <w:br/>
         <w:br/>
         <w:t>Join through our link: [SPORTS CENTERED TRACKING LINK]</w:t>
@@ -110,7 +119,7 @@
     </w:p>
     <w:p>
       <w:r>
-        <w:t>Ad — Daily picks. Full writeups. Tracked results. VIP $19.99/month through October 22. Join Kobe’s Betting Hub through our link. 21+ • Where legal • Bet responsibly • No guaranteed outcomes.</w:t>
+        <w:t>Ad — Daily picks. Full writeups. Tracked results. NEW beta arbitrage monitoring for potential time-sensitive opportunities. Verify live lines before wagering. VIP $19.99/month through October 22. Join Kobe’s Betting Hub through our link. 21+ • Where legal • Bet responsibly • No guaranteed outcomes.</w:t>
       </w:r>
     </w:p>
     <w:p>
@@ -146,6 +155,15 @@
       </w:pPr>
       <w:r>
         <w:t>Do not say guaranteed, lock, risk-free, can’t lose, fixed, insider, automatic profit, or promise a win rate.</w:t>
+      </w:r>
+    </w:p>
+    <w:p>
+      <w:pPr>
+        <w:pStyle w:val="ListBullet"/>
+        <w:ind w:left="360" w:hanging="187"/>
+      </w:pPr>
+      <w:r>
+        <w:t>Describe arbitrage as monitoring for potential opportunities—not guaranteed profit—and state that sportsbook lines can move, limit, or void wagers.</w:t>
       </w:r>
     </w:p>
     <w:p>

</xml_diff>

<commit_message>
Insert Sports Centered live tracking link
</commit_message>
<xml_diff>
--- a/deliverables/sports-centered/Sports_Centered_Promotion_Kit.docx
+++ b/deliverables/sports-centered/Sports_Centered_Promotion_Kit.docx
@@ -78,7 +78,7 @@
         <w:ind w:left="360" w:hanging="187"/>
       </w:pPr>
       <w:r>
-        <w:t>Use only the exact Sports Centered tracking link/code supplied by KBH.</w:t>
+        <w:t>Use only this Sports Centered tracking link: https://kobesbettinghub.com/join?ref=KBC-EA1532FF19</w:t>
       </w:r>
     </w:p>
     <w:p>
@@ -103,7 +103,7 @@
         <w:t>Daily picks, full writeups, and transparent tracked results—plus free Discord access and an optional VIP membership. NEW: beta arbitrage monitoring identifies potential time-sensitive opportunities across supported sportsbooks, with percentage-based examples to help members compare both sides. Always verify current lines before wagering. VIP is $19.99/month through October 22, then $32.99/month.</w:t>
         <w:br/>
         <w:br/>
-        <w:t>Join through our link: [SPORTS CENTERED TRACKING LINK]</w:t>
+        <w:t>Join through our link: https://kobesbettinghub.com/join?ref=KBC-EA1532FF19</w:t>
         <w:br/>
         <w:br/>
         <w:t>21+ • Where legal • Bet responsibly • No guaranteed outcomes</w:t>
@@ -119,7 +119,7 @@
     </w:p>
     <w:p>
       <w:r>
-        <w:t>Ad — Daily picks. Full writeups. Tracked results. NEW beta arbitrage monitoring for potential time-sensitive opportunities. Verify live lines before wagering. VIP $19.99/month through October 22. Join Kobe’s Betting Hub through our link. 21+ • Where legal • Bet responsibly • No guaranteed outcomes.</w:t>
+        <w:t>Ad — Daily picks. Full writeups. Tracked results. NEW beta arbitrage monitoring for potential time-sensitive opportunities. Verify live lines before wagering. VIP $19.99/month through October 22. Join: https://kobesbettinghub.com/join?ref=KBC-EA1532FF19. 21+ • Where legal • Bet responsibly • No guaranteed outcomes.</w:t>
       </w:r>
     </w:p>
     <w:p>

</xml_diff>